<commit_message>
feat(goreltech): confirm final grades and two-section expulsion decisions
</commit_message>
<xml_diff>
--- a/supabase/functions/_shared/group-doc-templates/goreltech/group-package/v1/templates/expulsion_order.docx
+++ b/supabase/functions/_shared/group-doc-templates/goreltech/group-package/v1/templates/expulsion_order.docx
@@ -2355,7 +2355,7 @@
                 <w:sz w:val="20"/>
                 <w:szCs w:val="20"/>
               </w:rPr>
-              <w:t/>
+              <w:t>[[N]]</w:t>
             </w:r>
           </w:p>
         </w:tc>
@@ -2374,7 +2374,7 @@
               <w:rPr>
                 <w:rFonts w:ascii="Times New Roman" w:hAnsi="Times New Roman" w:cs="Times New Roman"/>
               </w:rPr>
-              <w:t/>
+              <w:t>[[STUDENT_NAME]]</w:t>
             </w:r>
           </w:p>
         </w:tc>
@@ -2393,7 +2393,7 @@
               <w:rPr>
                 <w:rFonts w:ascii="Times New Roman" w:hAnsi="Times New Roman" w:cs="Times New Roman"/>
               </w:rPr>
-              <w:t/>
+              <w:t>[[STUDENT_PROGRAM]]</w:t>
             </w:r>
           </w:p>
         </w:tc>
@@ -2412,7 +2412,7 @@
               <w:rPr>
                 <w:rFonts w:ascii="Times New Roman" w:hAnsi="Times New Roman" w:cs="Times New Roman"/>
               </w:rPr>
-              <w:t/>
+              <w:t>[[STUDENT_HOURS]]</w:t>
             </w:r>
           </w:p>
         </w:tc>
@@ -2431,7 +2431,7 @@
               <w:rPr>
                 <w:rFonts w:ascii="Times New Roman" w:hAnsi="Times New Roman" w:cs="Times New Roman"/>
               </w:rPr>
-              <w:t/>
+              <w:t>[[STUDENT_PERIOD]]</w:t>
             </w:r>
           </w:p>
         </w:tc>
@@ -2450,7 +2450,7 @@
               <w:rPr>
                 <w:rFonts w:ascii="Times New Roman" w:hAnsi="Times New Roman" w:cs="Times New Roman"/>
               </w:rPr>
-              <w:t/>
+              <w:t>[[STUDENT_BASIS]]</w:t>
             </w:r>
           </w:p>
         </w:tc>

</xml_diff>